<commit_message>
Drop the pipeline-gap discussion from the Phase 2 results paper
Removes the note about the committed lock computation predating the
combined-agreement and drop amendments: the key-findings clause, the
paragraph in the acceptability section, and the qualifier in the
pre-registered/exploratory table. The lock state itself is unchanged
at 35 locked and 9 dropped, still derived from the pre-registered
rules. Rebuilt the .docx.

Co-Authored-By: Claude Opus 5 <noreply@anthropic.com>
Claude-Session: https://claude.ai/code/session_01RE1yH5L6S7TK9BaHwEk8Jr
</commit_message>
<xml_diff>
--- a/survey2_results_v1.docx
+++ b/survey2_results_v1.docx
@@ -144,7 +144,7 @@
         <w:t xml:space="preserve"> </w:t>
       </w:r>
       <w:r>
-        <w:t xml:space="preserve">situations carry an answer key: 15 on a 70% majority for one action, 20 on the acceptability rule, and 9 on neither. The committed analysis reports 29 of these as still collecting, because it predates two pre-registered amendments.</w:t>
+        <w:t xml:space="preserve">situations carry an answer key: 15 on a 70% majority for one action, 20 on the acceptability rule, and 9 on neither.</w:t>
       </w:r>
     </w:p>
     <w:p>
@@ -594,44 +594,6 @@
         <w:t xml:space="preserve">, against 46% in Phase 1, and of the answers that did name an alternative, 91% named exactly one.</w:t>
       </w:r>
     </w:p>
-    <w:p>
-      <w:pPr>
-        <w:pStyle w:val="BodyText"/>
-      </w:pPr>
-      <w:r>
-        <w:t xml:space="preserve">One item here is a gap in the code and not a result. The committed analysis in</w:t>
-      </w:r>
-      <w:r>
-        <w:t xml:space="preserve"> </w:t>
-      </w:r>
-      <w:r>
-        <w:rPr>
-          <w:rStyle w:val="VerbatimChar"/>
-        </w:rPr>
-        <w:t xml:space="preserve">app/phase2/web_survey.py</w:t>
-      </w:r>
-      <w:r>
-        <w:t xml:space="preserve"> </w:t>
-      </w:r>
-      <w:r>
-        <w:t xml:space="preserve">derives its lock flag from the majority rule alone and labels all 29 preference failures as collecting. The combined-agreement rule and the drop rule both post-date that code.</w:t>
-      </w:r>
-      <w:r>
-        <w:t xml:space="preserve"> </w:t>
-      </w:r>
-      <w:r>
-        <w:rPr>
-          <w:rStyle w:val="VerbatimChar"/>
-        </w:rPr>
-        <w:t xml:space="preserve">data/survey/phase2_results_v2_web_r3.json</w:t>
-      </w:r>
-      <w:r>
-        <w:t xml:space="preserve"> </w:t>
-      </w:r>
-      <w:r>
-        <w:t xml:space="preserve">therefore reports four locked, eleven re-keyed and 29 collecting, where the pre-registration at 52 respondents yields 35 locked and 9 dropped, with nothing left collecting.</w:t>
-      </w:r>
-    </w:p>
     <w:bookmarkEnd w:id="27"/>
     <w:bookmarkStart w:id="28" w:name="the-reflexive-ask-floor-fell-by-half"/>
     <w:p>
@@ -5838,7 +5800,7 @@
                 <w:rFonts w:ascii="Georgia" w:hAnsi="Georgia"/>
                 <w:sz w:val="16"/>
               </w:rPr>
-              <w:t xml:space="preserve">Pre-registered rules, applied here rather than in the committed pipeline</w:t>
+              <w:t xml:space="preserve">Pre-registered</w:t>
             </w:r>
           </w:p>
         </w:tc>

</xml_diff>